<commit_message>
v0.8.0 Author Dictionary Retrieval
</commit_message>
<xml_diff>
--- a/knowledge_base/АстроКурс Виктор Слободнюк.docx
+++ b/knowledge_base/АстроКурс Виктор Слободнюк.docx
@@ -3232,85 +3232,85 @@
           <w:szCs w:val="28"/>
           <w:shd w:val="clear" w:color="auto" w:fill="FFFFFF"/>
         </w:rPr>
+        <w:t xml:space="preserve">6-ой дом – </w:t>
+      </w:r>
+      <w:r>
+        <w:rPr>
+          <w:rFonts w:ascii="Arial" w:hAnsi="Arial" w:cs="Arial"/>
+          <w:color w:val="0F0F0F"/>
+          <w:sz w:val="28"/>
+          <w:szCs w:val="28"/>
+          <w:shd w:val="clear" w:color="auto" w:fill="FFFFFF"/>
+        </w:rPr>
+        <w:t>С</w:t>
+      </w:r>
+      <w:r>
+        <w:rPr>
+          <w:rFonts w:ascii="Arial" w:hAnsi="Arial" w:cs="Arial"/>
+          <w:color w:val="0F0F0F"/>
+          <w:sz w:val="28"/>
+          <w:szCs w:val="28"/>
+          <w:shd w:val="clear" w:color="auto" w:fill="FFFFFF"/>
+        </w:rPr>
+        <w:t xml:space="preserve">фера здоровья (сфера </w:t>
+      </w:r>
+      <w:r>
+        <w:rPr>
+          <w:rFonts w:ascii="Arial" w:hAnsi="Arial" w:cs="Arial"/>
+          <w:color w:val="0F0F0F"/>
+          <w:sz w:val="28"/>
+          <w:szCs w:val="28"/>
+          <w:shd w:val="clear" w:color="auto" w:fill="FFFFFF"/>
+        </w:rPr>
+        <w:t>услуг</w:t>
+      </w:r>
+      <w:r>
+        <w:rPr>
+          <w:rFonts w:ascii="Arial" w:hAnsi="Arial" w:cs="Arial"/>
+          <w:color w:val="0F0F0F"/>
+          <w:sz w:val="28"/>
+          <w:szCs w:val="28"/>
+          <w:shd w:val="clear" w:color="auto" w:fill="FFFFFF"/>
+        </w:rPr>
+        <w:t>, трудовая сфера)</w:t>
+      </w:r>
+      <w:r>
+        <w:rPr>
+          <w:rFonts w:ascii="Arial" w:hAnsi="Arial" w:cs="Arial"/>
+          <w:color w:val="0F0F0F"/>
+          <w:sz w:val="28"/>
+          <w:szCs w:val="28"/>
+          <w:shd w:val="clear" w:color="auto" w:fill="FFFFFF"/>
+        </w:rPr>
+        <w:t>.</w:t>
+      </w:r>
+    </w:p>
+    <w:p>
+      <w:pPr>
+        <w:pBdr>
+          <w:top w:val="single" w:sz="4" w:space="1" w:color="auto"/>
+          <w:left w:val="single" w:sz="4" w:space="4" w:color="auto"/>
+          <w:bottom w:val="single" w:sz="4" w:space="1" w:color="auto"/>
+          <w:right w:val="single" w:sz="4" w:space="4" w:color="auto"/>
+        </w:pBdr>
+        <w:spacing w:after="0" w:line="240" w:lineRule="auto"/>
+        <w:rPr>
+          <w:rFonts w:ascii="Arial" w:hAnsi="Arial" w:cs="Arial"/>
+          <w:color w:val="0F0F0F"/>
+          <w:sz w:val="28"/>
+          <w:szCs w:val="28"/>
+          <w:shd w:val="clear" w:color="auto" w:fill="FFFFFF"/>
+        </w:rPr>
+      </w:pPr>
+      <w:r>
+        <w:rPr>
+          <w:rFonts w:ascii="Arial" w:hAnsi="Arial" w:cs="Arial"/>
+          <w:color w:val="0F0F0F"/>
+          <w:sz w:val="28"/>
+          <w:szCs w:val="28"/>
+          <w:shd w:val="clear" w:color="auto" w:fill="FFFFFF"/>
+        </w:rPr>
         <w:lastRenderedPageBreak/>
-        <w:t xml:space="preserve">6-ой дом – </w:t>
-      </w:r>
-      <w:r>
-        <w:rPr>
-          <w:rFonts w:ascii="Arial" w:hAnsi="Arial" w:cs="Arial"/>
-          <w:color w:val="0F0F0F"/>
-          <w:sz w:val="28"/>
-          <w:szCs w:val="28"/>
-          <w:shd w:val="clear" w:color="auto" w:fill="FFFFFF"/>
-        </w:rPr>
-        <w:t>С</w:t>
-      </w:r>
-      <w:r>
-        <w:rPr>
-          <w:rFonts w:ascii="Arial" w:hAnsi="Arial" w:cs="Arial"/>
-          <w:color w:val="0F0F0F"/>
-          <w:sz w:val="28"/>
-          <w:szCs w:val="28"/>
-          <w:shd w:val="clear" w:color="auto" w:fill="FFFFFF"/>
-        </w:rPr>
-        <w:t xml:space="preserve">фера здоровья (сфера </w:t>
-      </w:r>
-      <w:r>
-        <w:rPr>
-          <w:rFonts w:ascii="Arial" w:hAnsi="Arial" w:cs="Arial"/>
-          <w:color w:val="0F0F0F"/>
-          <w:sz w:val="28"/>
-          <w:szCs w:val="28"/>
-          <w:shd w:val="clear" w:color="auto" w:fill="FFFFFF"/>
-        </w:rPr>
-        <w:t>услуг</w:t>
-      </w:r>
-      <w:r>
-        <w:rPr>
-          <w:rFonts w:ascii="Arial" w:hAnsi="Arial" w:cs="Arial"/>
-          <w:color w:val="0F0F0F"/>
-          <w:sz w:val="28"/>
-          <w:szCs w:val="28"/>
-          <w:shd w:val="clear" w:color="auto" w:fill="FFFFFF"/>
-        </w:rPr>
-        <w:t>, трудовая сфера)</w:t>
-      </w:r>
-      <w:r>
-        <w:rPr>
-          <w:rFonts w:ascii="Arial" w:hAnsi="Arial" w:cs="Arial"/>
-          <w:color w:val="0F0F0F"/>
-          <w:sz w:val="28"/>
-          <w:szCs w:val="28"/>
-          <w:shd w:val="clear" w:color="auto" w:fill="FFFFFF"/>
-        </w:rPr>
-        <w:t>.</w:t>
-      </w:r>
-    </w:p>
-    <w:p>
-      <w:pPr>
-        <w:pBdr>
-          <w:top w:val="single" w:sz="4" w:space="1" w:color="auto"/>
-          <w:left w:val="single" w:sz="4" w:space="4" w:color="auto"/>
-          <w:bottom w:val="single" w:sz="4" w:space="1" w:color="auto"/>
-          <w:right w:val="single" w:sz="4" w:space="4" w:color="auto"/>
-        </w:pBdr>
-        <w:spacing w:after="0" w:line="240" w:lineRule="auto"/>
-        <w:rPr>
-          <w:rFonts w:ascii="Arial" w:hAnsi="Arial" w:cs="Arial"/>
-          <w:color w:val="0F0F0F"/>
-          <w:sz w:val="28"/>
-          <w:szCs w:val="28"/>
-          <w:shd w:val="clear" w:color="auto" w:fill="FFFFFF"/>
-        </w:rPr>
-      </w:pPr>
-      <w:r>
-        <w:rPr>
-          <w:rFonts w:ascii="Arial" w:hAnsi="Arial" w:cs="Arial"/>
-          <w:color w:val="0F0F0F"/>
-          <w:sz w:val="28"/>
-          <w:szCs w:val="28"/>
-          <w:shd w:val="clear" w:color="auto" w:fill="FFFFFF"/>
-        </w:rPr>
         <w:t xml:space="preserve">7-ой дом – </w:t>
       </w:r>
       <w:r>
@@ -4965,7 +4965,6 @@
           <w:sz w:val="21"/>
           <w:szCs w:val="21"/>
           <w:shd w:val="clear" w:color="auto" w:fill="FFFFFF"/>
-          <w:lang w:val="en-US"/>
         </w:rPr>
       </w:pPr>
       <w:r>
@@ -5214,6 +5213,7 @@
           <w:sz w:val="28"/>
           <w:szCs w:val="28"/>
         </w:rPr>
+        <w:lastRenderedPageBreak/>
         <w:t xml:space="preserve">Гармоничные </w:t>
       </w:r>
       <w:r>
@@ -5688,8 +5688,6 @@
           </w:rPr>
           <w:t xml:space="preserve"> </w:t>
         </w:r>
-        <w:bookmarkStart w:id="0" w:name="_GoBack"/>
-        <w:bookmarkEnd w:id="0"/>
         <w:r>
           <w:rPr>
             <w:sz w:val="28"/>
@@ -5795,7 +5793,6 @@
         <w:rPr>
           <w:sz w:val="28"/>
           <w:szCs w:val="28"/>
-          <w:lang w:val="en-US"/>
         </w:rPr>
       </w:pPr>
       <w:r>
@@ -7367,41 +7364,24 @@
       </w:pPr>
       <w:r>
         <w:rPr>
-          <w:rFonts w:ascii="HamburgSymbols" w:hAnsi="HamburgSymbols" w:cs="Calibri"/>
-          <w:sz w:val="24"/>
-          <w:szCs w:val="24"/>
-          <w:lang w:val="en-US"/>
-        </w:rPr>
-        <w:t>E</w:t>
-      </w:r>
-      <w:r>
-        <w:rPr>
-          <w:sz w:val="24"/>
-          <w:szCs w:val="24"/>
-        </w:rPr>
-        <w:t xml:space="preserve">Меркурий – интеллектуальную активность, интерес, показывает </w:t>
-      </w:r>
-    </w:p>
-    <w:p>
-      <w:pPr>
-        <w:pBdr>
-          <w:top w:val="single" w:sz="4" w:space="1" w:color="auto"/>
-          <w:left w:val="single" w:sz="4" w:space="4" w:color="auto"/>
-          <w:bottom w:val="single" w:sz="4" w:space="1" w:color="auto"/>
-          <w:right w:val="single" w:sz="4" w:space="4" w:color="auto"/>
-        </w:pBdr>
-        <w:spacing w:after="0" w:line="240" w:lineRule="auto"/>
-        <w:rPr>
-          <w:sz w:val="24"/>
-          <w:szCs w:val="24"/>
-        </w:rPr>
-      </w:pPr>
-      <w:r>
-        <w:rPr>
-          <w:sz w:val="24"/>
-          <w:szCs w:val="24"/>
-        </w:rPr>
-        <w:t>обстоятельства учебы, знакомств, поездок.</w:t>
+          <w:sz w:val="24"/>
+          <w:szCs w:val="24"/>
+        </w:rPr>
+        <w:t>Меркур</w:t>
+      </w:r>
+      <w:r>
+        <w:rPr>
+          <w:sz w:val="24"/>
+          <w:szCs w:val="24"/>
+        </w:rPr>
+        <w:t>ий – интеллект</w:t>
+      </w:r>
+      <w:r>
+        <w:rPr>
+          <w:sz w:val="24"/>
+          <w:szCs w:val="24"/>
+        </w:rPr>
+        <w:t>, интерес, показывает обстоятельства учебы, знакомств, поездок.</w:t>
       </w:r>
     </w:p>
     <w:p>
@@ -7489,29 +7469,7 @@
           <w:sz w:val="24"/>
           <w:szCs w:val="24"/>
         </w:rPr>
-        <w:t xml:space="preserve">Юпитер – социальные связи, друзей, масштабность, </w:t>
-      </w:r>
-    </w:p>
-    <w:p>
-      <w:pPr>
-        <w:pBdr>
-          <w:top w:val="single" w:sz="4" w:space="1" w:color="auto"/>
-          <w:left w:val="single" w:sz="4" w:space="4" w:color="auto"/>
-          <w:bottom w:val="single" w:sz="4" w:space="1" w:color="auto"/>
-          <w:right w:val="single" w:sz="4" w:space="4" w:color="auto"/>
-        </w:pBdr>
-        <w:spacing w:after="0" w:line="240" w:lineRule="auto"/>
-        <w:rPr>
-          <w:sz w:val="24"/>
-          <w:szCs w:val="24"/>
-        </w:rPr>
-      </w:pPr>
-      <w:r>
-        <w:rPr>
-          <w:sz w:val="24"/>
-          <w:szCs w:val="24"/>
-        </w:rPr>
-        <w:t>справедливость, возмущение в случае ее отсутствия.</w:t>
+        <w:t>Юпитер – социальные связи, друзей, масштабность, справедливость, возмущение в случае ее отсутствия.</w:t>
       </w:r>
     </w:p>
     <w:p>
@@ -7555,23 +7513,15 @@
           <w:sz w:val="24"/>
           <w:szCs w:val="24"/>
         </w:rPr>
-        <w:t xml:space="preserve">Уран – стремление все знать, объяснения, причины поездок, в </w:t>
-      </w:r>
-    </w:p>
-    <w:p>
-      <w:pPr>
-        <w:pBdr>
-          <w:top w:val="single" w:sz="4" w:space="1" w:color="auto"/>
-          <w:left w:val="single" w:sz="4" w:space="4" w:color="auto"/>
-          <w:bottom w:val="single" w:sz="4" w:space="1" w:color="auto"/>
-          <w:right w:val="single" w:sz="4" w:space="4" w:color="auto"/>
-        </w:pBdr>
-        <w:spacing w:after="0" w:line="240" w:lineRule="auto"/>
-        <w:rPr>
-          <w:sz w:val="24"/>
-          <w:szCs w:val="24"/>
-        </w:rPr>
-      </w:pPr>
+        <w:t>Уран – стремление все знать, объяснения, причины поездок, в</w:t>
+      </w:r>
+      <w:r>
+        <w:rPr>
+          <w:sz w:val="24"/>
+          <w:szCs w:val="24"/>
+        </w:rPr>
+        <w:t xml:space="preserve"> </w:t>
+      </w:r>
       <w:r>
         <w:rPr>
           <w:sz w:val="24"/>
@@ -7621,8 +7571,39 @@
           <w:sz w:val="24"/>
           <w:szCs w:val="24"/>
         </w:rPr>
-        <w:t>Плутон – сотрудничество, парность или споры-конфликты.</w:t>
-      </w:r>
+        <w:t xml:space="preserve">Плутон – сотрудничество, </w:t>
+      </w:r>
+      <w:r>
+        <w:rPr>
+          <w:sz w:val="24"/>
+          <w:szCs w:val="24"/>
+        </w:rPr>
+        <w:t xml:space="preserve">взаимодействие с партнёром, </w:t>
+      </w:r>
+      <w:r>
+        <w:rPr>
+          <w:sz w:val="24"/>
+          <w:szCs w:val="24"/>
+        </w:rPr>
+        <w:t>парность или споры-конфликты.</w:t>
+      </w:r>
+    </w:p>
+    <w:p>
+      <w:pPr>
+        <w:pBdr>
+          <w:top w:val="single" w:sz="4" w:space="1" w:color="auto"/>
+          <w:left w:val="single" w:sz="4" w:space="4" w:color="auto"/>
+          <w:bottom w:val="single" w:sz="4" w:space="1" w:color="auto"/>
+          <w:right w:val="single" w:sz="4" w:space="4" w:color="auto"/>
+        </w:pBdr>
+        <w:spacing w:after="0" w:line="240" w:lineRule="auto"/>
+        <w:rPr>
+          <w:sz w:val="24"/>
+          <w:szCs w:val="24"/>
+        </w:rPr>
+      </w:pPr>
+      <w:bookmarkStart w:id="0" w:name="_GoBack"/>
+      <w:bookmarkEnd w:id="0"/>
     </w:p>
     <w:p>
       <w:pPr>
@@ -7854,65 +7835,65 @@
           <w:sz w:val="24"/>
           <w:szCs w:val="24"/>
         </w:rPr>
+        <w:t>В родном город</w:t>
+      </w:r>
+      <w:r>
+        <w:rPr>
+          <w:sz w:val="24"/>
+          <w:szCs w:val="24"/>
+        </w:rPr>
+        <w:t>е (IV) заниматься ветеранами.</w:t>
+      </w:r>
+    </w:p>
+    <w:p>
+      <w:pPr>
+        <w:pBdr>
+          <w:top w:val="single" w:sz="4" w:space="1" w:color="auto"/>
+          <w:left w:val="single" w:sz="4" w:space="4" w:color="auto"/>
+          <w:bottom w:val="single" w:sz="4" w:space="1" w:color="auto"/>
+          <w:right w:val="single" w:sz="4" w:space="4" w:color="auto"/>
+        </w:pBdr>
+        <w:spacing w:after="0" w:line="240" w:lineRule="auto"/>
+        <w:rPr>
+          <w:sz w:val="24"/>
+          <w:szCs w:val="24"/>
+        </w:rPr>
+      </w:pPr>
+      <w:r>
+        <w:rPr>
+          <w:sz w:val="24"/>
+          <w:szCs w:val="24"/>
+        </w:rPr>
+        <w:t>В юности (IV) создат</w:t>
+      </w:r>
+      <w:r>
+        <w:rPr>
+          <w:sz w:val="24"/>
+          <w:szCs w:val="24"/>
+        </w:rPr>
+        <w:t>ь «банду», группу, коллектив.</w:t>
+      </w:r>
+    </w:p>
+    <w:p>
+      <w:pPr>
+        <w:pBdr>
+          <w:top w:val="single" w:sz="4" w:space="1" w:color="auto"/>
+          <w:left w:val="single" w:sz="4" w:space="4" w:color="auto"/>
+          <w:bottom w:val="single" w:sz="4" w:space="1" w:color="auto"/>
+          <w:right w:val="single" w:sz="4" w:space="4" w:color="auto"/>
+        </w:pBdr>
+        <w:spacing w:after="0" w:line="240" w:lineRule="auto"/>
+        <w:rPr>
+          <w:sz w:val="24"/>
+          <w:szCs w:val="24"/>
+        </w:rPr>
+      </w:pPr>
+      <w:r>
+        <w:rPr>
+          <w:sz w:val="24"/>
+          <w:szCs w:val="24"/>
+        </w:rPr>
         <w:lastRenderedPageBreak/>
-        <w:t>В родном город</w:t>
-      </w:r>
-      <w:r>
-        <w:rPr>
-          <w:sz w:val="24"/>
-          <w:szCs w:val="24"/>
-        </w:rPr>
-        <w:t>е (IV) заниматься ветеранами.</w:t>
-      </w:r>
-    </w:p>
-    <w:p>
-      <w:pPr>
-        <w:pBdr>
-          <w:top w:val="single" w:sz="4" w:space="1" w:color="auto"/>
-          <w:left w:val="single" w:sz="4" w:space="4" w:color="auto"/>
-          <w:bottom w:val="single" w:sz="4" w:space="1" w:color="auto"/>
-          <w:right w:val="single" w:sz="4" w:space="4" w:color="auto"/>
-        </w:pBdr>
-        <w:spacing w:after="0" w:line="240" w:lineRule="auto"/>
-        <w:rPr>
-          <w:sz w:val="24"/>
-          <w:szCs w:val="24"/>
-        </w:rPr>
-      </w:pPr>
-      <w:r>
-        <w:rPr>
-          <w:sz w:val="24"/>
-          <w:szCs w:val="24"/>
-        </w:rPr>
-        <w:t>В юности (IV) создат</w:t>
-      </w:r>
-      <w:r>
-        <w:rPr>
-          <w:sz w:val="24"/>
-          <w:szCs w:val="24"/>
-        </w:rPr>
-        <w:t>ь «банду», группу, коллектив.</w:t>
-      </w:r>
-    </w:p>
-    <w:p>
-      <w:pPr>
-        <w:pBdr>
-          <w:top w:val="single" w:sz="4" w:space="1" w:color="auto"/>
-          <w:left w:val="single" w:sz="4" w:space="4" w:color="auto"/>
-          <w:bottom w:val="single" w:sz="4" w:space="1" w:color="auto"/>
-          <w:right w:val="single" w:sz="4" w:space="4" w:color="auto"/>
-        </w:pBdr>
-        <w:spacing w:after="0" w:line="240" w:lineRule="auto"/>
-        <w:rPr>
-          <w:sz w:val="24"/>
-          <w:szCs w:val="24"/>
-        </w:rPr>
-      </w:pPr>
-      <w:r>
-        <w:rPr>
-          <w:sz w:val="24"/>
-          <w:szCs w:val="24"/>
-        </w:rPr>
         <w:t>Пом</w:t>
       </w:r>
       <w:r>

</xml_diff>